<commit_message>
add data achieved to experience wolffun
</commit_message>
<xml_diff>
--- a/assets/cv/Hang_Nguyen_DA_CV.docx
+++ b/assets/cv/Hang_Nguyen_DA_CV.docx
@@ -201,8 +201,6 @@
         </w:rPr>
         <w:t>Bachelor of Business Analytics from National Economics University (GPA 3.87/4.0). Currently a Game Data Analyst supporting multiple live mobile titles — full descriptive → diagnostic → prescriptive analytics pipeline, ETL maintenance, custom-SQL Tableau dashboards, and ad-hoc deep-dives for Project Owners and Game Designers. Previously delivered an end-to-end HR Power BI dashboard at KPIM (Microsoft Partner) and led the data analysis phase of a recommendation system at VNPT IT.</w:t>
       </w:r>
-      <w:bookmarkStart w:id="0" w:name="_GoBack"/>
-      <w:bookmarkEnd w:id="0"/>
     </w:p>
     <w:p>
       <w:pPr>
@@ -288,12 +286,36 @@
       <w:r>
         <w:rPr>
           <w:rFonts w:ascii="Calibri" w:hAnsi="Calibri" w:eastAsia="Calibri" w:cs="Calibri"/>
-          <w:color w:val="0B1220"/>
-          <w:sz w:val="21"/>
-          <w:szCs w:val="21"/>
-        </w:rPr>
-        <w:t>Own end-to-end data flow from Firebase, Adjust, ad-mediation platforms, and Play Store: ETL maintenance, ETL job design, and custom SQL queries powering Tableau dashboards.</w:t>
-      </w:r>
+          <w:b/>
+          <w:bCs/>
+          <w:color w:val="0B1220"/>
+          <w:sz w:val="21"/>
+          <w:szCs w:val="21"/>
+        </w:rPr>
+        <w:t>Engagement-drop diagnostic on a match-3 puzzle</w:t>
+      </w:r>
+      <w:r>
+        <w:rPr>
+          <w:rFonts w:ascii="Calibri" w:hAnsi="Calibri" w:eastAsia="Calibri" w:cs="Calibri"/>
+          <w:color w:val="0B1220"/>
+          <w:sz w:val="21"/>
+          <w:szCs w:val="21"/>
+        </w:rPr>
+        <w:t xml:space="preserve"> — Funnel investigation with sibling-game baselines pinpointed level-design culprits behind a retention cliff. </w:t>
+      </w:r>
+      <w:r>
+        <w:rPr>
+          <w:rFonts w:ascii="Calibri" w:hAnsi="Calibri" w:eastAsia="Calibri" w:cs="Calibri"/>
+          <w:i/>
+          <w:iCs/>
+          <w:color w:val="0B1220"/>
+          <w:sz w:val="21"/>
+          <w:szCs w:val="21"/>
+        </w:rPr>
+        <w:t>Contributed to a ~2–4% drop in level-drop rate and improved day-over-day engagement.</w:t>
+      </w:r>
+      <w:bookmarkStart w:id="0" w:name="_GoBack"/>
+      <w:bookmarkEnd w:id="0"/>
     </w:p>
     <w:p>
       <w:pPr>
@@ -307,11 +329,33 @@
       <w:r>
         <w:rPr>
           <w:rFonts w:ascii="Calibri" w:hAnsi="Calibri" w:eastAsia="Calibri" w:cs="Calibri"/>
-          <w:color w:val="0B1220"/>
-          <w:sz w:val="21"/>
-          <w:szCs w:val="21"/>
-        </w:rPr>
-        <w:t>Drive descriptive → diagnostic → prescriptive analyses with ad-hoc deep-dives for Project Owners and Game Designers (engagement drops, user-cohort profiling, force-ad cap optimization, ad-quality monitoring, IAP price localization, and more).</w:t>
+          <w:b/>
+          <w:bCs/>
+          <w:color w:val="0B1220"/>
+          <w:sz w:val="21"/>
+          <w:szCs w:val="21"/>
+        </w:rPr>
+        <w:t>Ad-quality monitoring system</w:t>
+      </w:r>
+      <w:r>
+        <w:rPr>
+          <w:rFonts w:ascii="Calibri" w:hAnsi="Calibri" w:eastAsia="Calibri" w:cs="Calibri"/>
+          <w:color w:val="0B1220"/>
+          <w:sz w:val="21"/>
+          <w:szCs w:val="21"/>
+        </w:rPr>
+        <w:t xml:space="preserve"> — Automated pipeline scoring advertisers against behavioral baselines to flag toxic creatives. </w:t>
+      </w:r>
+      <w:r>
+        <w:rPr>
+          <w:rFonts w:ascii="Calibri" w:hAnsi="Calibri" w:eastAsia="Calibri" w:cs="Calibri"/>
+          <w:i/>
+          <w:iCs/>
+          <w:color w:val="0B1220"/>
+          <w:sz w:val="21"/>
+          <w:szCs w:val="21"/>
+        </w:rPr>
+        <w:t>Contributed to ~2% lower ad-attributable churn; saved ~4h of manual review per cycle.</w:t>
       </w:r>
     </w:p>
     <w:p>
@@ -326,11 +370,33 @@
       <w:r>
         <w:rPr>
           <w:rFonts w:ascii="Calibri" w:hAnsi="Calibri" w:eastAsia="Calibri" w:cs="Calibri"/>
-          <w:color w:val="0B1220"/>
-          <w:sz w:val="21"/>
-          <w:szCs w:val="21"/>
-        </w:rPr>
-        <w:t>Set up event tracking and ETL flows for new game launches, scaffolded from existing-game templates.</w:t>
+          <w:b/>
+          <w:bCs/>
+          <w:color w:val="0B1220"/>
+          <w:sz w:val="21"/>
+          <w:szCs w:val="21"/>
+        </w:rPr>
+        <w:t>Force-ad cap optimization</w:t>
+      </w:r>
+      <w:r>
+        <w:rPr>
+          <w:rFonts w:ascii="Calibri" w:hAnsi="Calibri" w:eastAsia="Calibri" w:cs="Calibri"/>
+          <w:color w:val="0B1220"/>
+          <w:sz w:val="21"/>
+          <w:szCs w:val="21"/>
+        </w:rPr>
+        <w:t xml:space="preserve"> — Behavioral-percentile + LTV-curve methodologies recommended a lower daily cap. </w:t>
+      </w:r>
+      <w:r>
+        <w:rPr>
+          <w:rFonts w:ascii="Calibri" w:hAnsi="Calibri" w:eastAsia="Calibri" w:cs="Calibri"/>
+          <w:i/>
+          <w:iCs/>
+          <w:color w:val="0B1220"/>
+          <w:sz w:val="21"/>
+          <w:szCs w:val="21"/>
+        </w:rPr>
+        <w:t>Contributed to ~20% higher engagement minutes with LTV holding steady.</w:t>
       </w:r>
     </w:p>
     <w:p>
@@ -349,7 +415,7 @@
           <w:sz w:val="21"/>
           <w:szCs w:val="21"/>
         </w:rPr>
-        <w:t>Run weekly KPI monitoring across all live titles; surface anomalies and lead diagnostic investigation when metrics move unexpectedly.</w:t>
+        <w:t>End-to-end data flow (Firebase, Adjust, mediation, Play Store): ETL pipelines, custom-SQL Tableau dashboards, event tracking for new launches.</w:t>
       </w:r>
     </w:p>
     <w:p>
@@ -368,7 +434,27 @@
           <w:sz w:val="21"/>
           <w:szCs w:val="21"/>
         </w:rPr>
-        <w:t>Authored an internal Game Metrics Framework brief used by new analysts and game designers during onboarding.</w:t>
+        <w:t xml:space="preserve">Weekly KPI monitoring with diagnostic deep-dives; authored internal </w:t>
+      </w:r>
+      <w:r>
+        <w:rPr>
+          <w:rFonts w:ascii="Calibri" w:hAnsi="Calibri" w:eastAsia="Calibri" w:cs="Calibri"/>
+          <w:b/>
+          <w:bCs/>
+          <w:color w:val="0B1220"/>
+          <w:sz w:val="21"/>
+          <w:szCs w:val="21"/>
+        </w:rPr>
+        <w:t>Game Metrics Framework</w:t>
+      </w:r>
+      <w:r>
+        <w:rPr>
+          <w:rFonts w:ascii="Calibri" w:hAnsi="Calibri" w:eastAsia="Calibri" w:cs="Calibri"/>
+          <w:color w:val="0B1220"/>
+          <w:sz w:val="21"/>
+          <w:szCs w:val="21"/>
+        </w:rPr>
+        <w:t xml:space="preserve"> for analyst onboarding.</w:t>
       </w:r>
     </w:p>
     <w:p>
@@ -428,7 +514,7 @@
         <w:pStyle w:val="17"/>
         <w:numPr>
           <w:ilvl w:val="0"/>
-          <w:numId w:val="1"/>
+          <w:numId w:val="2"/>
         </w:numPr>
         <w:spacing w:after="60"/>
       </w:pPr>
@@ -447,7 +533,7 @@
         <w:pStyle w:val="17"/>
         <w:numPr>
           <w:ilvl w:val="0"/>
-          <w:numId w:val="1"/>
+          <w:numId w:val="2"/>
         </w:numPr>
         <w:spacing w:after="60"/>
       </w:pPr>
@@ -466,7 +552,7 @@
         <w:pStyle w:val="17"/>
         <w:numPr>
           <w:ilvl w:val="0"/>
-          <w:numId w:val="1"/>
+          <w:numId w:val="2"/>
         </w:numPr>
         <w:spacing w:after="60"/>
       </w:pPr>
@@ -485,7 +571,7 @@
         <w:pStyle w:val="17"/>
         <w:numPr>
           <w:ilvl w:val="0"/>
-          <w:numId w:val="1"/>
+          <w:numId w:val="2"/>
         </w:numPr>
         <w:spacing w:after="60"/>
       </w:pPr>
@@ -556,7 +642,7 @@
         <w:pStyle w:val="17"/>
         <w:numPr>
           <w:ilvl w:val="0"/>
-          <w:numId w:val="1"/>
+          <w:numId w:val="2"/>
         </w:numPr>
         <w:spacing w:after="60"/>
       </w:pPr>
@@ -575,7 +661,7 @@
         <w:pStyle w:val="17"/>
         <w:numPr>
           <w:ilvl w:val="0"/>
-          <w:numId w:val="1"/>
+          <w:numId w:val="2"/>
         </w:numPr>
         <w:spacing w:after="60"/>
       </w:pPr>
@@ -594,7 +680,7 @@
         <w:pStyle w:val="17"/>
         <w:numPr>
           <w:ilvl w:val="0"/>
-          <w:numId w:val="1"/>
+          <w:numId w:val="2"/>
         </w:numPr>
         <w:spacing w:after="60"/>
       </w:pPr>
@@ -685,7 +771,7 @@
         <w:pStyle w:val="17"/>
         <w:numPr>
           <w:ilvl w:val="0"/>
-          <w:numId w:val="1"/>
+          <w:numId w:val="2"/>
         </w:numPr>
         <w:spacing w:after="60"/>
       </w:pPr>
@@ -704,7 +790,7 @@
         <w:pStyle w:val="17"/>
         <w:numPr>
           <w:ilvl w:val="0"/>
-          <w:numId w:val="1"/>
+          <w:numId w:val="2"/>
         </w:numPr>
         <w:spacing w:after="60"/>
       </w:pPr>
@@ -723,7 +809,7 @@
         <w:pStyle w:val="17"/>
         <w:numPr>
           <w:ilvl w:val="0"/>
-          <w:numId w:val="1"/>
+          <w:numId w:val="2"/>
         </w:numPr>
         <w:spacing w:after="60"/>
       </w:pPr>
@@ -762,7 +848,7 @@
         <w:pStyle w:val="17"/>
         <w:numPr>
           <w:ilvl w:val="0"/>
-          <w:numId w:val="1"/>
+          <w:numId w:val="2"/>
         </w:numPr>
         <w:spacing w:after="60"/>
       </w:pPr>
@@ -821,7 +907,7 @@
         <w:pStyle w:val="17"/>
         <w:numPr>
           <w:ilvl w:val="0"/>
-          <w:numId w:val="1"/>
+          <w:numId w:val="2"/>
         </w:numPr>
         <w:spacing w:after="60"/>
       </w:pPr>
@@ -851,7 +937,7 @@
         <w:pStyle w:val="17"/>
         <w:numPr>
           <w:ilvl w:val="0"/>
-          <w:numId w:val="1"/>
+          <w:numId w:val="2"/>
         </w:numPr>
         <w:spacing w:after="60"/>
       </w:pPr>
@@ -901,7 +987,7 @@
         <w:pStyle w:val="17"/>
         <w:numPr>
           <w:ilvl w:val="0"/>
-          <w:numId w:val="1"/>
+          <w:numId w:val="2"/>
         </w:numPr>
         <w:spacing w:after="60"/>
       </w:pPr>
@@ -931,7 +1017,7 @@
         <w:pStyle w:val="17"/>
         <w:numPr>
           <w:ilvl w:val="0"/>
-          <w:numId w:val="1"/>
+          <w:numId w:val="2"/>
         </w:numPr>
         <w:spacing w:after="60"/>
       </w:pPr>
@@ -961,7 +1047,7 @@
         <w:pStyle w:val="17"/>
         <w:numPr>
           <w:ilvl w:val="0"/>
-          <w:numId w:val="1"/>
+          <w:numId w:val="2"/>
         </w:numPr>
         <w:spacing w:after="60"/>
       </w:pPr>
@@ -991,7 +1077,7 @@
         <w:pStyle w:val="17"/>
         <w:numPr>
           <w:ilvl w:val="0"/>
-          <w:numId w:val="1"/>
+          <w:numId w:val="2"/>
         </w:numPr>
         <w:spacing w:after="60"/>
       </w:pPr>
@@ -1041,7 +1127,7 @@
         <w:pStyle w:val="17"/>
         <w:numPr>
           <w:ilvl w:val="0"/>
-          <w:numId w:val="1"/>
+          <w:numId w:val="2"/>
         </w:numPr>
         <w:spacing w:after="60"/>
       </w:pPr>
@@ -1071,7 +1157,7 @@
         <w:pStyle w:val="17"/>
         <w:numPr>
           <w:ilvl w:val="0"/>
-          <w:numId w:val="1"/>
+          <w:numId w:val="2"/>
         </w:numPr>
         <w:spacing w:after="60"/>
       </w:pPr>
@@ -1101,7 +1187,7 @@
         <w:pStyle w:val="17"/>
         <w:numPr>
           <w:ilvl w:val="0"/>
-          <w:numId w:val="1"/>
+          <w:numId w:val="2"/>
         </w:numPr>
         <w:spacing w:after="60"/>
       </w:pPr>
@@ -1131,7 +1217,7 @@
         <w:pStyle w:val="17"/>
         <w:numPr>
           <w:ilvl w:val="0"/>
-          <w:numId w:val="1"/>
+          <w:numId w:val="2"/>
         </w:numPr>
         <w:spacing w:after="60"/>
       </w:pPr>
@@ -1161,7 +1247,7 @@
         <w:pStyle w:val="17"/>
         <w:numPr>
           <w:ilvl w:val="0"/>
-          <w:numId w:val="1"/>
+          <w:numId w:val="2"/>
         </w:numPr>
         <w:spacing w:after="60"/>
       </w:pPr>
@@ -1283,7 +1369,27 @@
       </w:pPr>
     </w:lvl>
   </w:abstractNum>
+  <w:abstractNum w:abstractNumId="1">
+    <w:nsid w:val="59ADCABA"/>
+    <w:multiLevelType w:val="singleLevel"/>
+    <w:tmpl w:val="59ADCABA"/>
+    <w:lvl w:ilvl="0" w:tentative="0">
+      <w:start w:val="1"/>
+      <w:numFmt w:val="bullet"/>
+      <w:lvlText w:val="•"/>
+      <w:lvlJc w:val="left"/>
+      <w:pPr>
+        <w:ind w:left="360" w:hanging="360"/>
+      </w:pPr>
+    </w:lvl>
+  </w:abstractNum>
   <w:num w:numId="1">
+    <w:abstractNumId w:val="1"/>
+    <w:lvlOverride w:ilvl="0">
+      <w:startOverride w:val="1"/>
+    </w:lvlOverride>
+  </w:num>
+  <w:num w:numId="2">
     <w:abstractNumId w:val="0"/>
     <w:lvlOverride w:ilvl="0">
       <w:startOverride w:val="1"/>

</xml_diff>